<commit_message>
docs(arc2): VP-5 — Plan Phase 5 (Machining + Sub-LOT Split)
v0.2j → v0.2k.

- Migration filename updated.
- IsPieceCountIncrement flag concept retired — OI-23
  v_LotDerivedQuantities view (Phase 2) handles derivation; no
  ALTER on Parts.OperationTemplate.
- MachiningOut_Record execution sequence updated for v1.9 checkpoint
  shape (cumulative ShotCount/ScrapCount; no per-event
  GoodCount/NoGoodCount; no Lot.PieceCount mutation).
- Open Items table refreshed: UJ-03 still In Review (Ben pending);
  OI-09, OI-18, UJ-11 closed.
- Sublot split confirmed Machining-only per OI-09 (Die Cast
  cavity-parallel LOTs are peers, not sublots).
- OperationTemplate seed restricted to non-hot fields.

No SQL changes. Documentation alignment.
</commit_message>
<xml_diff>
--- a/MPP_MES_PHASED_PLAN_PLANT_FLOOR.docx
+++ b/MPP_MES_PHASED_PLAN_PLANT_FLOOR.docx
@@ -26,7 +26,7 @@
         <w:t xml:space="preserve"> </w:t>
       </w:r>
       <w:r>
-        <w:t xml:space="preserve">MPP-PLAN-ARC2-v0.2j</w:t>
+        <w:t xml:space="preserve">MPP-PLAN-ARC2-v0.2k</w:t>
       </w:r>
       <w:r>
         <w:t xml:space="preserve"> </w:t>
@@ -74,7 +74,7 @@
         <w:t xml:space="preserve"> </w:t>
       </w:r>
       <w:r>
-        <w:t xml:space="preserve">0.2j (2026-04-27)</w:t>
+        <w:t xml:space="preserve">0.2k (2026-04-27)</w:t>
       </w:r>
       <w:r>
         <w:t xml:space="preserve"> </w:t>
@@ -335,7 +335,7 @@
               <w:pStyle w:val="Compact"/>
             </w:pPr>
             <w:r>
-              <w:t xml:space="preserve">0.2j</w:t>
+              <w:t xml:space="preserve">0.2k</w:t>
             </w:r>
           </w:p>
         </w:tc>
@@ -381,73 +381,79 @@
                 <w:b/>
                 <w:bCs/>
               </w:rPr>
-              <w:t xml:space="preserve">VP-4: Plan Phase 4 (Movement + Trim + Receiving) — OI-11/12/18 + checkpoint-shape ProductionEvent.</w:t>
-            </w:r>
-            <w:r>
-              <w:t xml:space="preserve"> </w:t>
-            </w:r>
-            <w:r>
-              <w:t xml:space="preserve">Trim section rewritten for OI-11 Casting→Trim 1-line BOM consumption (closed 2026-04-22; no separate</w:t>
-            </w:r>
-            <w:r>
-              <w:t xml:space="preserve"> </w:t>
-            </w:r>
-            <w:r>
-              <w:rPr>
-                <w:rStyle w:val="VerbatimChar"/>
-              </w:rPr>
-              <w:t xml:space="preserve">Parts.ItemTransform</w:t>
-            </w:r>
-            <w:r>
-              <w:t xml:space="preserve"> </w:t>
-            </w:r>
-            <w:r>
-              <w:t xml:space="preserve">table; existing</w:t>
-            </w:r>
-            <w:r>
-              <w:t xml:space="preserve"> </w:t>
-            </w:r>
-            <w:r>
-              <w:rPr>
-                <w:rStyle w:val="VerbatimChar"/>
-              </w:rPr>
-              <w:t xml:space="preserve">Parts.Bom</w:t>
-            </w:r>
-            <w:r>
-              <w:t xml:space="preserve"> </w:t>
-            </w:r>
-            <w:r>
-              <w:t xml:space="preserve">+</w:t>
-            </w:r>
-            <w:r>
-              <w:t xml:space="preserve"> </w:t>
-            </w:r>
-            <w:r>
-              <w:rPr>
-                <w:rStyle w:val="VerbatimChar"/>
-              </w:rPr>
-              <w:t xml:space="preserve">Workorder.ConsumptionEvent</w:t>
-            </w:r>
-            <w:r>
-              <w:t xml:space="preserve"> </w:t>
-            </w:r>
-            <w:r>
-              <w:t xml:space="preserve">+</w:t>
-            </w:r>
-            <w:r>
-              <w:t xml:space="preserve"> </w:t>
-            </w:r>
-            <w:r>
-              <w:rPr>
-                <w:rStyle w:val="VerbatimChar"/>
-              </w:rPr>
-              <w:t xml:space="preserve">Lots.LotGenealogy</w:t>
-            </w:r>
-            <w:r>
-              <w:t xml:space="preserve"> </w:t>
-            </w:r>
-            <w:r>
-              <w:t xml:space="preserve">carry it). ProductionEvent_Record calls updated to v1.9 checkpoint signature (cumulative</w:t>
+              <w:t xml:space="preserve">VP-5: Plan Phase 5 (Machining with Sub-LOT Split) — checkpoint-shape ProductionEvent + OI-18 cascade.</w:t>
+            </w:r>
+            <w:r>
+              <w:t xml:space="preserve"> </w:t>
+            </w:r>
+            <w:r>
+              <w:rPr>
+                <w:rStyle w:val="VerbatimChar"/>
+              </w:rPr>
+              <w:t xml:space="preserve">IsPieceCountIncrement</w:t>
+            </w:r>
+            <w:r>
+              <w:t xml:space="preserve"> </w:t>
+            </w:r>
+            <w:r>
+              <w:t xml:space="preserve">flag on</w:t>
+            </w:r>
+            <w:r>
+              <w:t xml:space="preserve"> </w:t>
+            </w:r>
+            <w:r>
+              <w:rPr>
+                <w:rStyle w:val="VerbatimChar"/>
+              </w:rPr>
+              <w:t xml:space="preserve">Parts.OperationTemplate</w:t>
+            </w:r>
+            <w:r>
+              <w:t xml:space="preserve"> </w:t>
+            </w:r>
+            <w:r>
+              <w:t xml:space="preserve">retired — Lot piece count is now derived from</w:t>
+            </w:r>
+            <w:r>
+              <w:t xml:space="preserve"> </w:t>
+            </w:r>
+            <w:r>
+              <w:rPr>
+                <w:rStyle w:val="VerbatimChar"/>
+              </w:rPr>
+              <w:t xml:space="preserve">Lots.v_LotDerivedQuantities</w:t>
+            </w:r>
+            <w:r>
+              <w:t xml:space="preserve"> </w:t>
+            </w:r>
+            <w:r>
+              <w:t xml:space="preserve">view (OI-23 / Phase 2) at read time; no ALTER needed on</w:t>
+            </w:r>
+            <w:r>
+              <w:t xml:space="preserve"> </w:t>
+            </w:r>
+            <w:r>
+              <w:rPr>
+                <w:rStyle w:val="VerbatimChar"/>
+              </w:rPr>
+              <w:t xml:space="preserve">OperationTemplate</w:t>
+            </w:r>
+            <w:r>
+              <w:t xml:space="preserve">.</w:t>
+            </w:r>
+            <w:r>
+              <w:t xml:space="preserve"> </w:t>
+            </w:r>
+            <w:r>
+              <w:rPr>
+                <w:rStyle w:val="VerbatimChar"/>
+              </w:rPr>
+              <w:t xml:space="preserve">MachiningOut_Record</w:t>
+            </w:r>
+            <w:r>
+              <w:t xml:space="preserve"> </w:t>
+            </w:r>
+            <w:r>
+              <w:t xml:space="preserve">signature updated to use cumulative</w:t>
             </w:r>
             <w:r>
               <w:t xml:space="preserve"> </w:t>
@@ -468,16 +474,19 @@
               <w:t xml:space="preserve">ScrapCount</w:t>
             </w:r>
             <w:r>
-              <w:t xml:space="preserve">; no</w:t>
-            </w:r>
-            <w:r>
-              <w:t xml:space="preserve"> </w:t>
-            </w:r>
-            <w:r>
-              <w:rPr>
-                <w:rStyle w:val="VerbatimChar"/>
-              </w:rPr>
-              <w:t xml:space="preserve">LocationId</w:t>
+              <w:t xml:space="preserve"> </w:t>
+            </w:r>
+            <w:r>
+              <w:t xml:space="preserve">per v0.2i checkpoint shape (no</w:t>
+            </w:r>
+            <w:r>
+              <w:t xml:space="preserve"> </w:t>
+            </w:r>
+            <w:r>
+              <w:rPr>
+                <w:rStyle w:val="VerbatimChar"/>
+              </w:rPr>
+              <w:t xml:space="preserve">@GoodCount</w:t>
             </w:r>
             <w:r>
               <w:t xml:space="preserve">/</w:t>
@@ -486,43 +495,10 @@
               <w:rPr>
                 <w:rStyle w:val="VerbatimChar"/>
               </w:rPr>
-              <w:t xml:space="preserve">GoodCount</w:t>
-            </w:r>
-            <w:r>
-              <w:t xml:space="preserve">/</w:t>
-            </w:r>
-            <w:r>
-              <w:rPr>
-                <w:rStyle w:val="VerbatimChar"/>
-              </w:rPr>
-              <w:t xml:space="preserve">NoGoodCount</w:t>
-            </w:r>
-            <w:r>
-              <w:t xml:space="preserve">). Movement Scan Screen scan-in validation extended for OI-12 (</w:t>
-            </w:r>
-            <w:r>
-              <w:rPr>
-                <w:rStyle w:val="VerbatimChar"/>
-              </w:rPr>
-              <w:t xml:space="preserve">Parts.Item.MaxParts</w:t>
-            </w:r>
-            <w:r>
-              <w:t xml:space="preserve"> </w:t>
-            </w:r>
-            <w:r>
-              <w:t xml:space="preserve">per-Item per-Location cap) + OI-18 (</w:t>
-            </w:r>
-            <w:r>
-              <w:rPr>
-                <w:rStyle w:val="VerbatimChar"/>
-              </w:rPr>
-              <w:t xml:space="preserve">Parts.ItemLocation_IsEligible</w:t>
-            </w:r>
-            <w:r>
-              <w:t xml:space="preserve"> </w:t>
-            </w:r>
-            <w:r>
-              <w:t xml:space="preserve">cascade walk Cell → WorkCenter → Area). Open Items table refreshed — OI-11, OI-12, OI-18, OI-08, UJ-11, UJ-13 all closed. Migration filename updated.</w:t>
+              <w:t xml:space="preserve">@NoGoodCount</w:t>
+            </w:r>
+            <w:r>
+              <w:t xml:space="preserve">). Movement Scan Screen scan-in cascade (OI-18) applies at Machining IN — pulled from Phase 4 reusable pattern. Sublot split is the canonical pattern per OI-09 / FDS-05-022 (Machining-only — Die Cast cavity-parallel LOTs are peers, not sublots). UJ-03 sublot trigger still In Review (Ben pending). Migration filename updated.</w:t>
             </w:r>
           </w:p>
         </w:tc>
@@ -535,7 +511,7 @@
               <w:pStyle w:val="Compact"/>
             </w:pPr>
             <w:r>
-              <w:t xml:space="preserve">0.2i</w:t>
+              <w:t xml:space="preserve">0.2j</w:t>
             </w:r>
           </w:p>
         </w:tc>
@@ -572,13 +548,73 @@
                 <w:b/>
                 <w:bCs/>
               </w:rPr>
-              <w:t xml:space="preserve">VP-3: Plan Phase 3 (Die Cast Operator Station) — full rewrite against v1.9 design.</w:t>
-            </w:r>
-            <w:r>
-              <w:t xml:space="preserve"> </w:t>
-            </w:r>
-            <w:r>
-              <w:t xml:space="preserve">ProductionEvent_Record signature reshaped to checkpoint form (cumulative</w:t>
+              <w:t xml:space="preserve">VP-4: Plan Phase 4 (Movement + Trim + Receiving) — OI-11/12/18 + checkpoint-shape ProductionEvent.</w:t>
+            </w:r>
+            <w:r>
+              <w:t xml:space="preserve"> </w:t>
+            </w:r>
+            <w:r>
+              <w:t xml:space="preserve">Trim section rewritten for OI-11 Casting→Trim 1-line BOM consumption (closed 2026-04-22; no separate</w:t>
+            </w:r>
+            <w:r>
+              <w:t xml:space="preserve"> </w:t>
+            </w:r>
+            <w:r>
+              <w:rPr>
+                <w:rStyle w:val="VerbatimChar"/>
+              </w:rPr>
+              <w:t xml:space="preserve">Parts.ItemTransform</w:t>
+            </w:r>
+            <w:r>
+              <w:t xml:space="preserve"> </w:t>
+            </w:r>
+            <w:r>
+              <w:t xml:space="preserve">table; existing</w:t>
+            </w:r>
+            <w:r>
+              <w:t xml:space="preserve"> </w:t>
+            </w:r>
+            <w:r>
+              <w:rPr>
+                <w:rStyle w:val="VerbatimChar"/>
+              </w:rPr>
+              <w:t xml:space="preserve">Parts.Bom</w:t>
+            </w:r>
+            <w:r>
+              <w:t xml:space="preserve"> </w:t>
+            </w:r>
+            <w:r>
+              <w:t xml:space="preserve">+</w:t>
+            </w:r>
+            <w:r>
+              <w:t xml:space="preserve"> </w:t>
+            </w:r>
+            <w:r>
+              <w:rPr>
+                <w:rStyle w:val="VerbatimChar"/>
+              </w:rPr>
+              <w:t xml:space="preserve">Workorder.ConsumptionEvent</w:t>
+            </w:r>
+            <w:r>
+              <w:t xml:space="preserve"> </w:t>
+            </w:r>
+            <w:r>
+              <w:t xml:space="preserve">+</w:t>
+            </w:r>
+            <w:r>
+              <w:t xml:space="preserve"> </w:t>
+            </w:r>
+            <w:r>
+              <w:rPr>
+                <w:rStyle w:val="VerbatimChar"/>
+              </w:rPr>
+              <w:t xml:space="preserve">Lots.LotGenealogy</w:t>
+            </w:r>
+            <w:r>
+              <w:t xml:space="preserve"> </w:t>
+            </w:r>
+            <w:r>
+              <w:t xml:space="preserve">carry it). ProductionEvent_Record calls updated to v1.9 checkpoint signature (cumulative</w:t>
             </w:r>
             <w:r>
               <w:t xml:space="preserve"> </w:t>
@@ -599,43 +635,7 @@
               <w:t xml:space="preserve">ScrapCount</w:t>
             </w:r>
             <w:r>
-              <w:t xml:space="preserve">,</w:t>
-            </w:r>
-            <w:r>
-              <w:t xml:space="preserve"> </w:t>
-            </w:r>
-            <w:r>
-              <w:rPr>
-                <w:rStyle w:val="VerbatimChar"/>
-              </w:rPr>
-              <w:t xml:space="preserve">EventAt</w:t>
-            </w:r>
-            <w:r>
-              <w:t xml:space="preserve">; dropped</w:t>
-            </w:r>
-            <w:r>
-              <w:t xml:space="preserve"> </w:t>
-            </w:r>
-            <w:r>
-              <w:rPr>
-                <w:rStyle w:val="VerbatimChar"/>
-              </w:rPr>
-              <w:t xml:space="preserve">DieIdentifier</w:t>
-            </w:r>
-            <w:r>
-              <w:t xml:space="preserve">,</w:t>
-            </w:r>
-            <w:r>
-              <w:t xml:space="preserve"> </w:t>
-            </w:r>
-            <w:r>
-              <w:rPr>
-                <w:rStyle w:val="VerbatimChar"/>
-              </w:rPr>
-              <w:t xml:space="preserve">CavityNumber</w:t>
-            </w:r>
-            <w:r>
-              <w:t xml:space="preserve">,</w:t>
+              <w:t xml:space="preserve">; no</w:t>
             </w:r>
             <w:r>
               <w:t xml:space="preserve"> </w:t>
@@ -647,22 +647,7 @@
               <w:t xml:space="preserve">LocationId</w:t>
             </w:r>
             <w:r>
-              <w:t xml:space="preserve">,</w:t>
-            </w:r>
-            <w:r>
-              <w:t xml:space="preserve"> </w:t>
-            </w:r>
-            <w:r>
-              <w:rPr>
-                <w:rStyle w:val="VerbatimChar"/>
-              </w:rPr>
-              <w:t xml:space="preserve">ItemId</w:t>
-            </w:r>
-            <w:r>
-              <w:t xml:space="preserve">, per-event</w:t>
-            </w:r>
-            <w:r>
-              <w:t xml:space="preserve"> </w:t>
+              <w:t xml:space="preserve">/</w:t>
             </w:r>
             <w:r>
               <w:rPr>
@@ -680,136 +665,31 @@
               <w:t xml:space="preserve">NoGoodCount</w:t>
             </w:r>
             <w:r>
-              <w:t xml:space="preserve">,</w:t>
-            </w:r>
-            <w:r>
-              <w:t xml:space="preserve"> </w:t>
-            </w:r>
-            <w:r>
-              <w:rPr>
-                <w:rStyle w:val="VerbatimChar"/>
-              </w:rPr>
-              <w:t xml:space="preserve">RecordedAt</w:t>
-            </w:r>
-            <w:r>
-              <w:t xml:space="preserve">). Carlos walkthrough rewritten — Tool + Cavity auto-populated from</w:t>
-            </w:r>
-            <w:r>
-              <w:t xml:space="preserve"> </w:t>
-            </w:r>
-            <w:r>
-              <w:rPr>
-                <w:rStyle w:val="VerbatimChar"/>
-              </w:rPr>
-              <w:t xml:space="preserve">Tools.ToolAssignment_ListActiveByCell</w:t>
-            </w:r>
-            <w:r>
-              <w:t xml:space="preserve">, operator confirms via tap, elevated Edit triggers inline</w:t>
-            </w:r>
-            <w:r>
-              <w:t xml:space="preserve"> </w:t>
-            </w:r>
-            <w:r>
-              <w:rPr>
-                <w:rStyle w:val="VerbatimChar"/>
-              </w:rPr>
-              <w:t xml:space="preserve">ToolAssignment_Release</w:t>
-            </w:r>
-            <w:r>
-              <w:t xml:space="preserve">/</w:t>
-            </w:r>
-            <w:r>
-              <w:rPr>
-                <w:rStyle w:val="VerbatimChar"/>
-              </w:rPr>
-              <w:t xml:space="preserve">_Assign</w:t>
-            </w:r>
-            <w:r>
-              <w:t xml:space="preserve">. OperationTemplate seed list pruned —</w:t>
-            </w:r>
-            <w:r>
-              <w:t xml:space="preserve"> </w:t>
-            </w:r>
-            <w:r>
-              <w:rPr>
-                <w:rStyle w:val="VerbatimChar"/>
-              </w:rPr>
-              <w:t xml:space="preserve">DieIdentifier</w:t>
-            </w:r>
-            <w:r>
-              <w:t xml:space="preserve"> </w:t>
-            </w:r>
-            <w:r>
-              <w:t xml:space="preserve">/</w:t>
-            </w:r>
-            <w:r>
-              <w:t xml:space="preserve"> </w:t>
-            </w:r>
-            <w:r>
-              <w:rPr>
-                <w:rStyle w:val="VerbatimChar"/>
-              </w:rPr>
-              <w:t xml:space="preserve">CavityNumber</w:t>
-            </w:r>
-            <w:r>
-              <w:t xml:space="preserve"> </w:t>
-            </w:r>
-            <w:r>
-              <w:t xml:space="preserve">/</w:t>
-            </w:r>
-            <w:r>
-              <w:t xml:space="preserve"> </w:t>
-            </w:r>
-            <w:r>
-              <w:rPr>
-                <w:rStyle w:val="VerbatimChar"/>
-              </w:rPr>
-              <w:t xml:space="preserve">WarmupShotCount</w:t>
-            </w:r>
-            <w:r>
-              <w:t xml:space="preserve"> </w:t>
-            </w:r>
-            <w:r>
-              <w:t xml:space="preserve">removed (Tool/Cavity on Lot per overlay B; warm-up on</w:t>
-            </w:r>
-            <w:r>
-              <w:t xml:space="preserve"> </w:t>
-            </w:r>
-            <w:r>
-              <w:rPr>
-                <w:rStyle w:val="VerbatimChar"/>
-              </w:rPr>
-              <w:t xml:space="preserve">DowntimeEvent</w:t>
-            </w:r>
-            <w:r>
-              <w:t xml:space="preserve"> </w:t>
-            </w:r>
-            <w:r>
-              <w:t xml:space="preserve">only per UJ-14 Option A). Open Items table refreshed — UJ-14 closed (Option A —</w:t>
-            </w:r>
-            <w:r>
-              <w:t xml:space="preserve"> </w:t>
-            </w:r>
-            <w:r>
-              <w:rPr>
-                <w:rStyle w:val="VerbatimChar"/>
-              </w:rPr>
-              <w:t xml:space="preserve">DowntimeEvent.ShotCount</w:t>
-            </w:r>
-            <w:r>
-              <w:t xml:space="preserve">); UJ-11 closed (Option A — flagged risk); OI-09 closed (cavity-parallel peers). New</w:t>
-            </w:r>
-            <w:r>
-              <w:t xml:space="preserve"> </w:t>
-            </w:r>
-            <w:r>
-              <w:t xml:space="preserve">“Cavity-parallel LOTs at Die Cast”</w:t>
-            </w:r>
-            <w:r>
-              <w:t xml:space="preserve"> </w:t>
-            </w:r>
-            <w:r>
-              <w:t xml:space="preserve">subsection. Migration filename updated. Pulled overlay B/C/E/F into Phase 3 body.</w:t>
+              <w:t xml:space="preserve">). Movement Scan Screen scan-in validation extended for OI-12 (</w:t>
+            </w:r>
+            <w:r>
+              <w:rPr>
+                <w:rStyle w:val="VerbatimChar"/>
+              </w:rPr>
+              <w:t xml:space="preserve">Parts.Item.MaxParts</w:t>
+            </w:r>
+            <w:r>
+              <w:t xml:space="preserve"> </w:t>
+            </w:r>
+            <w:r>
+              <w:t xml:space="preserve">per-Item per-Location cap) + OI-18 (</w:t>
+            </w:r>
+            <w:r>
+              <w:rPr>
+                <w:rStyle w:val="VerbatimChar"/>
+              </w:rPr>
+              <w:t xml:space="preserve">Parts.ItemLocation_IsEligible</w:t>
+            </w:r>
+            <w:r>
+              <w:t xml:space="preserve"> </w:t>
+            </w:r>
+            <w:r>
+              <w:t xml:space="preserve">cascade walk Cell → WorkCenter → Area). Open Items table refreshed — OI-11, OI-12, OI-18, OI-08, UJ-11, UJ-13 all closed. Migration filename updated.</w:t>
             </w:r>
           </w:p>
         </w:tc>
@@ -825,7 +705,7 @@
               <w:pStyle w:val="Compact"/>
             </w:pPr>
             <w:r>
-              <w:t xml:space="preserve">0.2h</w:t>
+              <w:t xml:space="preserve">0.2i</w:t>
             </w:r>
           </w:p>
         </w:tc>
@@ -871,97 +751,244 @@
                 <w:b/>
                 <w:bCs/>
               </w:rPr>
-              <w:t xml:space="preserve">VP-2: Plan Phase 2 (LOT Lifecycle Completion) — PauseEvent + view folded into body.</w:t>
-            </w:r>
-            <w:r>
-              <w:t xml:space="preserve"> </w:t>
-            </w:r>
-            <w:r>
-              <w:t xml:space="preserve">Adds</w:t>
-            </w:r>
-            <w:r>
-              <w:t xml:space="preserve"> </w:t>
-            </w:r>
-            <w:r>
-              <w:rPr>
-                <w:rStyle w:val="VerbatimChar"/>
-              </w:rPr>
-              <w:t xml:space="preserve">Lots.PauseEvent</w:t>
-            </w:r>
-            <w:r>
-              <w:t xml:space="preserve"> </w:t>
-            </w:r>
-            <w:r>
-              <w:t xml:space="preserve">table CREATE (OI-21 / FDS-05-038) + 4 procs (</w:t>
-            </w:r>
-            <w:r>
-              <w:rPr>
-                <w:rStyle w:val="VerbatimChar"/>
-              </w:rPr>
-              <w:t xml:space="preserve">LotPause_Place / _Resume / _GetByLocation / _GetCountsByLocation</w:t>
-            </w:r>
-            <w:r>
-              <w:t xml:space="preserve">) — pulled from v0.2 Overlay K. Adds</w:t>
-            </w:r>
-            <w:r>
-              <w:t xml:space="preserve"> </w:t>
-            </w:r>
-            <w:r>
-              <w:rPr>
-                <w:rStyle w:val="VerbatimChar"/>
-              </w:rPr>
-              <w:t xml:space="preserve">Lots.v_LotDerivedQuantities</w:t>
-            </w:r>
-            <w:r>
-              <w:t xml:space="preserve"> </w:t>
-            </w:r>
-            <w:r>
-              <w:t xml:space="preserve">view CREATE (OI-23 / FDS-05-031) + view-join read paths in</w:t>
-            </w:r>
-            <w:r>
-              <w:t xml:space="preserve"> </w:t>
-            </w:r>
-            <w:r>
-              <w:rPr>
-                <w:rStyle w:val="VerbatimChar"/>
-              </w:rPr>
-              <w:t xml:space="preserve">Lot_Get</w:t>
-            </w:r>
-            <w:r>
-              <w:t xml:space="preserve"> </w:t>
+              <w:t xml:space="preserve">VP-3: Plan Phase 3 (Die Cast Operator Station) — full rewrite against v1.9 design.</w:t>
+            </w:r>
+            <w:r>
+              <w:t xml:space="preserve"> </w:t>
+            </w:r>
+            <w:r>
+              <w:t xml:space="preserve">ProductionEvent_Record signature reshaped to checkpoint form (cumulative</w:t>
+            </w:r>
+            <w:r>
+              <w:t xml:space="preserve"> </w:t>
+            </w:r>
+            <w:r>
+              <w:rPr>
+                <w:rStyle w:val="VerbatimChar"/>
+              </w:rPr>
+              <w:t xml:space="preserve">ShotCount</w:t>
             </w:r>
             <w:r>
               <w:t xml:space="preserve">/</w:t>
             </w:r>
             <w:r>
-              <w:t xml:space="preserve"> </w:t>
-            </w:r>
-            <w:r>
-              <w:rPr>
-                <w:rStyle w:val="VerbatimChar"/>
-              </w:rPr>
-              <w:t xml:space="preserve">Lot_List</w:t>
-            </w:r>
-            <w:r>
-              <w:t xml:space="preserve"> </w:t>
-            </w:r>
-            <w:r>
-              <w:t xml:space="preserve">— pulled from v0.2 Overlay D. Open Items table: UJ-08 closed (Option A — proc-enforced merge rules); merge rule narrative refreshed (same Item + die-rank-compat from</w:t>
-            </w:r>
-            <w:r>
-              <w:t xml:space="preserve"> </w:t>
-            </w:r>
-            <w:r>
-              <w:rPr>
-                <w:rStyle w:val="VerbatimChar"/>
-              </w:rPr>
-              <w:t xml:space="preserve">Tools.DieRankCompatibility</w:t>
-            </w:r>
-            <w:r>
-              <w:t xml:space="preserve"> </w:t>
-            </w:r>
-            <w:r>
-              <w:t xml:space="preserve">+ supervisor override; FIFO-by-cavity is NOT a merge); test suite files updated; B10 still pending UJ-05 resolution. Migration-number reference updated.</w:t>
+              <w:rPr>
+                <w:rStyle w:val="VerbatimChar"/>
+              </w:rPr>
+              <w:t xml:space="preserve">ScrapCount</w:t>
+            </w:r>
+            <w:r>
+              <w:t xml:space="preserve">,</w:t>
+            </w:r>
+            <w:r>
+              <w:t xml:space="preserve"> </w:t>
+            </w:r>
+            <w:r>
+              <w:rPr>
+                <w:rStyle w:val="VerbatimChar"/>
+              </w:rPr>
+              <w:t xml:space="preserve">EventAt</w:t>
+            </w:r>
+            <w:r>
+              <w:t xml:space="preserve">; dropped</w:t>
+            </w:r>
+            <w:r>
+              <w:t xml:space="preserve"> </w:t>
+            </w:r>
+            <w:r>
+              <w:rPr>
+                <w:rStyle w:val="VerbatimChar"/>
+              </w:rPr>
+              <w:t xml:space="preserve">DieIdentifier</w:t>
+            </w:r>
+            <w:r>
+              <w:t xml:space="preserve">,</w:t>
+            </w:r>
+            <w:r>
+              <w:t xml:space="preserve"> </w:t>
+            </w:r>
+            <w:r>
+              <w:rPr>
+                <w:rStyle w:val="VerbatimChar"/>
+              </w:rPr>
+              <w:t xml:space="preserve">CavityNumber</w:t>
+            </w:r>
+            <w:r>
+              <w:t xml:space="preserve">,</w:t>
+            </w:r>
+            <w:r>
+              <w:t xml:space="preserve"> </w:t>
+            </w:r>
+            <w:r>
+              <w:rPr>
+                <w:rStyle w:val="VerbatimChar"/>
+              </w:rPr>
+              <w:t xml:space="preserve">LocationId</w:t>
+            </w:r>
+            <w:r>
+              <w:t xml:space="preserve">,</w:t>
+            </w:r>
+            <w:r>
+              <w:t xml:space="preserve"> </w:t>
+            </w:r>
+            <w:r>
+              <w:rPr>
+                <w:rStyle w:val="VerbatimChar"/>
+              </w:rPr>
+              <w:t xml:space="preserve">ItemId</w:t>
+            </w:r>
+            <w:r>
+              <w:t xml:space="preserve">, per-event</w:t>
+            </w:r>
+            <w:r>
+              <w:t xml:space="preserve"> </w:t>
+            </w:r>
+            <w:r>
+              <w:rPr>
+                <w:rStyle w:val="VerbatimChar"/>
+              </w:rPr>
+              <w:t xml:space="preserve">GoodCount</w:t>
+            </w:r>
+            <w:r>
+              <w:t xml:space="preserve">/</w:t>
+            </w:r>
+            <w:r>
+              <w:rPr>
+                <w:rStyle w:val="VerbatimChar"/>
+              </w:rPr>
+              <w:t xml:space="preserve">NoGoodCount</w:t>
+            </w:r>
+            <w:r>
+              <w:t xml:space="preserve">,</w:t>
+            </w:r>
+            <w:r>
+              <w:t xml:space="preserve"> </w:t>
+            </w:r>
+            <w:r>
+              <w:rPr>
+                <w:rStyle w:val="VerbatimChar"/>
+              </w:rPr>
+              <w:t xml:space="preserve">RecordedAt</w:t>
+            </w:r>
+            <w:r>
+              <w:t xml:space="preserve">). Carlos walkthrough rewritten — Tool + Cavity auto-populated from</w:t>
+            </w:r>
+            <w:r>
+              <w:t xml:space="preserve"> </w:t>
+            </w:r>
+            <w:r>
+              <w:rPr>
+                <w:rStyle w:val="VerbatimChar"/>
+              </w:rPr>
+              <w:t xml:space="preserve">Tools.ToolAssignment_ListActiveByCell</w:t>
+            </w:r>
+            <w:r>
+              <w:t xml:space="preserve">, operator confirms via tap, elevated Edit triggers inline</w:t>
+            </w:r>
+            <w:r>
+              <w:t xml:space="preserve"> </w:t>
+            </w:r>
+            <w:r>
+              <w:rPr>
+                <w:rStyle w:val="VerbatimChar"/>
+              </w:rPr>
+              <w:t xml:space="preserve">ToolAssignment_Release</w:t>
+            </w:r>
+            <w:r>
+              <w:t xml:space="preserve">/</w:t>
+            </w:r>
+            <w:r>
+              <w:rPr>
+                <w:rStyle w:val="VerbatimChar"/>
+              </w:rPr>
+              <w:t xml:space="preserve">_Assign</w:t>
+            </w:r>
+            <w:r>
+              <w:t xml:space="preserve">. OperationTemplate seed list pruned —</w:t>
+            </w:r>
+            <w:r>
+              <w:t xml:space="preserve"> </w:t>
+            </w:r>
+            <w:r>
+              <w:rPr>
+                <w:rStyle w:val="VerbatimChar"/>
+              </w:rPr>
+              <w:t xml:space="preserve">DieIdentifier</w:t>
+            </w:r>
+            <w:r>
+              <w:t xml:space="preserve"> </w:t>
+            </w:r>
+            <w:r>
+              <w:t xml:space="preserve">/</w:t>
+            </w:r>
+            <w:r>
+              <w:t xml:space="preserve"> </w:t>
+            </w:r>
+            <w:r>
+              <w:rPr>
+                <w:rStyle w:val="VerbatimChar"/>
+              </w:rPr>
+              <w:t xml:space="preserve">CavityNumber</w:t>
+            </w:r>
+            <w:r>
+              <w:t xml:space="preserve"> </w:t>
+            </w:r>
+            <w:r>
+              <w:t xml:space="preserve">/</w:t>
+            </w:r>
+            <w:r>
+              <w:t xml:space="preserve"> </w:t>
+            </w:r>
+            <w:r>
+              <w:rPr>
+                <w:rStyle w:val="VerbatimChar"/>
+              </w:rPr>
+              <w:t xml:space="preserve">WarmupShotCount</w:t>
+            </w:r>
+            <w:r>
+              <w:t xml:space="preserve"> </w:t>
+            </w:r>
+            <w:r>
+              <w:t xml:space="preserve">removed (Tool/Cavity on Lot per overlay B; warm-up on</w:t>
+            </w:r>
+            <w:r>
+              <w:t xml:space="preserve"> </w:t>
+            </w:r>
+            <w:r>
+              <w:rPr>
+                <w:rStyle w:val="VerbatimChar"/>
+              </w:rPr>
+              <w:t xml:space="preserve">DowntimeEvent</w:t>
+            </w:r>
+            <w:r>
+              <w:t xml:space="preserve"> </w:t>
+            </w:r>
+            <w:r>
+              <w:t xml:space="preserve">only per UJ-14 Option A). Open Items table refreshed — UJ-14 closed (Option A —</w:t>
+            </w:r>
+            <w:r>
+              <w:t xml:space="preserve"> </w:t>
+            </w:r>
+            <w:r>
+              <w:rPr>
+                <w:rStyle w:val="VerbatimChar"/>
+              </w:rPr>
+              <w:t xml:space="preserve">DowntimeEvent.ShotCount</w:t>
+            </w:r>
+            <w:r>
+              <w:t xml:space="preserve">); UJ-11 closed (Option A — flagged risk); OI-09 closed (cavity-parallel peers). New</w:t>
+            </w:r>
+            <w:r>
+              <w:t xml:space="preserve"> </w:t>
+            </w:r>
+            <w:r>
+              <w:t xml:space="preserve">“Cavity-parallel LOTs at Die Cast”</w:t>
+            </w:r>
+            <w:r>
+              <w:t xml:space="preserve"> </w:t>
+            </w:r>
+            <w:r>
+              <w:t xml:space="preserve">subsection. Migration filename updated. Pulled overlay B/C/E/F into Phase 3 body.</w:t>
             </w:r>
           </w:p>
         </w:tc>
@@ -974,7 +1001,7 @@
               <w:pStyle w:val="Compact"/>
             </w:pPr>
             <w:r>
-              <w:t xml:space="preserve">0.2g</w:t>
+              <w:t xml:space="preserve">0.2h</w:t>
             </w:r>
           </w:p>
         </w:tc>
@@ -1011,76 +1038,97 @@
                 <w:b/>
                 <w:bCs/>
               </w:rPr>
-              <w:t xml:space="preserve">VP-1: Plan Phase 1 freshening.</w:t>
-            </w:r>
-            <w:r>
-              <w:t xml:space="preserve"> </w:t>
-            </w:r>
-            <w:r>
-              <w:t xml:space="preserve">B4 (Gateway script layer contract) updated for FDS-01-014 / UJ-18 — sync direct-call retired in favour of Gateway-script-async via</w:t>
-            </w:r>
-            <w:r>
-              <w:t xml:space="preserve"> </w:t>
-            </w:r>
-            <w:r>
-              <w:rPr>
-                <w:rStyle w:val="VerbatimChar"/>
-              </w:rPr>
-              <w:t xml:space="preserve">system.util.sendMessageAsync</w:t>
-            </w:r>
-            <w:r>
-              <w:t xml:space="preserve">; AIM pool topup is the canonical example. Phase 1 LocationAttributeDefinition seed list adds</w:t>
-            </w:r>
-            <w:r>
-              <w:t xml:space="preserve"> </w:t>
-            </w:r>
-            <w:r>
-              <w:rPr>
-                <w:rStyle w:val="VerbatimChar"/>
-              </w:rPr>
-              <w:t xml:space="preserve">ConfirmationMethod</w:t>
-            </w:r>
-            <w:r>
-              <w:t xml:space="preserve"> </w:t>
-            </w:r>
-            <w:r>
-              <w:t xml:space="preserve">(UJ-17 / FDS-10-013) on the relevant</w:t>
-            </w:r>
-            <w:r>
-              <w:t xml:space="preserve"> </w:t>
-            </w:r>
-            <w:r>
-              <w:rPr>
-                <w:rStyle w:val="VerbatimChar"/>
-              </w:rPr>
-              <w:t xml:space="preserve">Cell</w:t>
-            </w:r>
-            <w:r>
-              <w:t xml:space="preserve">-tier</w:t>
-            </w:r>
-            <w:r>
-              <w:t xml:space="preserve"> </w:t>
-            </w:r>
-            <w:r>
-              <w:rPr>
-                <w:rStyle w:val="VerbatimChar"/>
-              </w:rPr>
-              <w:t xml:space="preserve">LocationTypeDefinition</w:t>
-            </w:r>
-            <w:r>
-              <w:t xml:space="preserve">s. Phase 1</w:t>
-            </w:r>
-            <w:r>
-              <w:t xml:space="preserve"> </w:t>
-            </w:r>
-            <w:r>
-              <w:t xml:space="preserve">“Open Items Affecting This Phase”</w:t>
-            </w:r>
-            <w:r>
-              <w:t xml:space="preserve"> </w:t>
-            </w:r>
-            <w:r>
-              <w:t xml:space="preserve">table refreshed — UJ-10 closure (Option D / FDS-09-015) reflected.</w:t>
+              <w:t xml:space="preserve">VP-2: Plan Phase 2 (LOT Lifecycle Completion) — PauseEvent + view folded into body.</w:t>
+            </w:r>
+            <w:r>
+              <w:t xml:space="preserve"> </w:t>
+            </w:r>
+            <w:r>
+              <w:t xml:space="preserve">Adds</w:t>
+            </w:r>
+            <w:r>
+              <w:t xml:space="preserve"> </w:t>
+            </w:r>
+            <w:r>
+              <w:rPr>
+                <w:rStyle w:val="VerbatimChar"/>
+              </w:rPr>
+              <w:t xml:space="preserve">Lots.PauseEvent</w:t>
+            </w:r>
+            <w:r>
+              <w:t xml:space="preserve"> </w:t>
+            </w:r>
+            <w:r>
+              <w:t xml:space="preserve">table CREATE (OI-21 / FDS-05-038) + 4 procs (</w:t>
+            </w:r>
+            <w:r>
+              <w:rPr>
+                <w:rStyle w:val="VerbatimChar"/>
+              </w:rPr>
+              <w:t xml:space="preserve">LotPause_Place / _Resume / _GetByLocation / _GetCountsByLocation</w:t>
+            </w:r>
+            <w:r>
+              <w:t xml:space="preserve">) — pulled from v0.2 Overlay K. Adds</w:t>
+            </w:r>
+            <w:r>
+              <w:t xml:space="preserve"> </w:t>
+            </w:r>
+            <w:r>
+              <w:rPr>
+                <w:rStyle w:val="VerbatimChar"/>
+              </w:rPr>
+              <w:t xml:space="preserve">Lots.v_LotDerivedQuantities</w:t>
+            </w:r>
+            <w:r>
+              <w:t xml:space="preserve"> </w:t>
+            </w:r>
+            <w:r>
+              <w:t xml:space="preserve">view CREATE (OI-23 / FDS-05-031) + view-join read paths in</w:t>
+            </w:r>
+            <w:r>
+              <w:t xml:space="preserve"> </w:t>
+            </w:r>
+            <w:r>
+              <w:rPr>
+                <w:rStyle w:val="VerbatimChar"/>
+              </w:rPr>
+              <w:t xml:space="preserve">Lot_Get</w:t>
+            </w:r>
+            <w:r>
+              <w:t xml:space="preserve"> </w:t>
+            </w:r>
+            <w:r>
+              <w:t xml:space="preserve">/</w:t>
+            </w:r>
+            <w:r>
+              <w:t xml:space="preserve"> </w:t>
+            </w:r>
+            <w:r>
+              <w:rPr>
+                <w:rStyle w:val="VerbatimChar"/>
+              </w:rPr>
+              <w:t xml:space="preserve">Lot_List</w:t>
+            </w:r>
+            <w:r>
+              <w:t xml:space="preserve"> </w:t>
+            </w:r>
+            <w:r>
+              <w:t xml:space="preserve">— pulled from v0.2 Overlay D. Open Items table: UJ-08 closed (Option A — proc-enforced merge rules); merge rule narrative refreshed (same Item + die-rank-compat from</w:t>
+            </w:r>
+            <w:r>
+              <w:t xml:space="preserve"> </w:t>
+            </w:r>
+            <w:r>
+              <w:rPr>
+                <w:rStyle w:val="VerbatimChar"/>
+              </w:rPr>
+              <w:t xml:space="preserve">Tools.DieRankCompatibility</w:t>
+            </w:r>
+            <w:r>
+              <w:t xml:space="preserve"> </w:t>
+            </w:r>
+            <w:r>
+              <w:t xml:space="preserve">+ supervisor override; FIFO-by-cavity is NOT a merge); test suite files updated; B10 still pending UJ-05 resolution. Migration-number reference updated.</w:t>
             </w:r>
           </w:p>
         </w:tc>
@@ -1096,7 +1144,7 @@
               <w:pStyle w:val="Compact"/>
             </w:pPr>
             <w:r>
-              <w:t xml:space="preserve">0.2f</w:t>
+              <w:t xml:space="preserve">0.2g</w:t>
             </w:r>
           </w:p>
         </w:tc>
@@ -1142,25 +1190,76 @@
                 <w:b/>
                 <w:bCs/>
               </w:rPr>
-              <w:t xml:space="preserve">VP-0: front matter + Plan Phase 0 refreshed against current state (Data Model v1.9i, FDS v0.11j, OIR v2.14, Seeding Registry v1.0).</w:t>
-            </w:r>
-            <w:r>
-              <w:t xml:space="preserve"> </w:t>
-            </w:r>
-            <w:r>
-              <w:t xml:space="preserve">UJ batch closures (UJ-04, UJ-09, UJ-10, UJ-11, UJ-13, UJ-14, UJ-16, UJ-17, UJ-18) and Part A closures (OI-12, -13, -14, -15, -16, -17, -18, -19, -20, -21, -22, -23, -32b) since v0.2e moved out of gating/opportunistic into the</w:t>
-            </w:r>
-            <w:r>
-              <w:t xml:space="preserve"> </w:t>
-            </w:r>
-            <w:r>
-              <w:t xml:space="preserve">“Already closed”</w:t>
-            </w:r>
-            <w:r>
-              <w:t xml:space="preserve"> </w:t>
-            </w:r>
-            <w:r>
-              <w:t xml:space="preserve">list. Gating list narrowed to truly-still-gating items. Migration-number reference updated for queued OI-07 + OI-12 correction migrations. v0.2 Alignment Overlay §K (Phase 0 open-items refresh) regenerated with the same scope. Per-phase narratives below (Phases 2–8) still pending VP-1..VP-Final passes.</w:t>
+              <w:t xml:space="preserve">VP-1: Plan Phase 1 freshening.</w:t>
+            </w:r>
+            <w:r>
+              <w:t xml:space="preserve"> </w:t>
+            </w:r>
+            <w:r>
+              <w:t xml:space="preserve">B4 (Gateway script layer contract) updated for FDS-01-014 / UJ-18 — sync direct-call retired in favour of Gateway-script-async via</w:t>
+            </w:r>
+            <w:r>
+              <w:t xml:space="preserve"> </w:t>
+            </w:r>
+            <w:r>
+              <w:rPr>
+                <w:rStyle w:val="VerbatimChar"/>
+              </w:rPr>
+              <w:t xml:space="preserve">system.util.sendMessageAsync</w:t>
+            </w:r>
+            <w:r>
+              <w:t xml:space="preserve">; AIM pool topup is the canonical example. Phase 1 LocationAttributeDefinition seed list adds</w:t>
+            </w:r>
+            <w:r>
+              <w:t xml:space="preserve"> </w:t>
+            </w:r>
+            <w:r>
+              <w:rPr>
+                <w:rStyle w:val="VerbatimChar"/>
+              </w:rPr>
+              <w:t xml:space="preserve">ConfirmationMethod</w:t>
+            </w:r>
+            <w:r>
+              <w:t xml:space="preserve"> </w:t>
+            </w:r>
+            <w:r>
+              <w:t xml:space="preserve">(UJ-17 / FDS-10-013) on the relevant</w:t>
+            </w:r>
+            <w:r>
+              <w:t xml:space="preserve"> </w:t>
+            </w:r>
+            <w:r>
+              <w:rPr>
+                <w:rStyle w:val="VerbatimChar"/>
+              </w:rPr>
+              <w:t xml:space="preserve">Cell</w:t>
+            </w:r>
+            <w:r>
+              <w:t xml:space="preserve">-tier</w:t>
+            </w:r>
+            <w:r>
+              <w:t xml:space="preserve"> </w:t>
+            </w:r>
+            <w:r>
+              <w:rPr>
+                <w:rStyle w:val="VerbatimChar"/>
+              </w:rPr>
+              <w:t xml:space="preserve">LocationTypeDefinition</w:t>
+            </w:r>
+            <w:r>
+              <w:t xml:space="preserve">s. Phase 1</w:t>
+            </w:r>
+            <w:r>
+              <w:t xml:space="preserve"> </w:t>
+            </w:r>
+            <w:r>
+              <w:t xml:space="preserve">“Open Items Affecting This Phase”</w:t>
+            </w:r>
+            <w:r>
+              <w:t xml:space="preserve"> </w:t>
+            </w:r>
+            <w:r>
+              <w:t xml:space="preserve">table refreshed — UJ-10 closure (Option D / FDS-09-015) reflected.</w:t>
             </w:r>
           </w:p>
         </w:tc>
@@ -1173,18 +1272,18 @@
               <w:pStyle w:val="Compact"/>
             </w:pPr>
             <w:r>
-              <w:t xml:space="preserve">0.2e</w:t>
-            </w:r>
-          </w:p>
-        </w:tc>
-        <w:tc>
-          <w:tcPr/>
-          <w:p>
-            <w:pPr>
-              <w:pStyle w:val="Compact"/>
-            </w:pPr>
-            <w:r>
-              <w:t xml:space="preserve">2026-04-24</w:t>
+              <w:t xml:space="preserve">0.2f</w:t>
+            </w:r>
+          </w:p>
+        </w:tc>
+        <w:tc>
+          <w:tcPr/>
+          <w:p>
+            <w:pPr>
+              <w:pStyle w:val="Compact"/>
+            </w:pPr>
+            <w:r>
+              <w:t xml:space="preserve">2026-04-27</w:t>
             </w:r>
           </w:p>
         </w:tc>
@@ -1210,35 +1309,115 @@
                 <w:b/>
                 <w:bCs/>
               </w:rPr>
-              <w:t xml:space="preserve">OI-16 PLC confirm BIT +</w:t>
-            </w:r>
+              <w:t xml:space="preserve">VP-0: front matter + Plan Phase 0 refreshed against current state (Data Model v1.9i, FDS v0.11j, OIR v2.14, Seeding Registry v1.0).</w:t>
+            </w:r>
+            <w:r>
+              <w:t xml:space="preserve"> </w:t>
+            </w:r>
+            <w:r>
+              <w:t xml:space="preserve">UJ batch closures (UJ-04, UJ-09, UJ-10, UJ-11, UJ-13, UJ-14, UJ-16, UJ-17, UJ-18) and Part A closures (OI-12, -13, -14, -15, -16, -17, -18, -19, -20, -21, -22, -23, -32b) since v0.2e moved out of gating/opportunistic into the</w:t>
+            </w:r>
+            <w:r>
+              <w:t xml:space="preserve"> </w:t>
+            </w:r>
+            <w:r>
+              <w:t xml:space="preserve">“Already closed”</w:t>
+            </w:r>
+            <w:r>
+              <w:t xml:space="preserve"> </w:t>
+            </w:r>
+            <w:r>
+              <w:t xml:space="preserve">list. Gating list narrowed to truly-still-gating items. Migration-number reference updated for queued OI-07 + OI-12 correction migrations. v0.2 Alignment Overlay §K (Phase 0 open-items refresh) regenerated with the same scope. Per-phase narratives below (Phases 2–8) still pending VP-1..VP-Final passes.</w:t>
+            </w:r>
+          </w:p>
+        </w:tc>
+      </w:tr>
+      <w:tr>
+        <w:tc>
+          <w:tcPr>
+            <w:shd w:val="clear" w:color="auto" w:fill="F2F2F2"/>
+          </w:tcPr>
+          <w:tcPr/>
+          <w:p>
+            <w:pPr>
+              <w:pStyle w:val="Compact"/>
+            </w:pPr>
+            <w:r>
+              <w:t xml:space="preserve">0.2e</w:t>
+            </w:r>
+          </w:p>
+        </w:tc>
+        <w:tc>
+          <w:tcPr>
+            <w:shd w:val="clear" w:color="auto" w:fill="F2F2F2"/>
+          </w:tcPr>
+          <w:tcPr/>
+          <w:p>
+            <w:pPr>
+              <w:pStyle w:val="Compact"/>
+            </w:pPr>
+            <w:r>
+              <w:t xml:space="preserve">2026-04-24</w:t>
+            </w:r>
+          </w:p>
+        </w:tc>
+        <w:tc>
+          <w:tcPr>
+            <w:shd w:val="clear" w:color="auto" w:fill="F2F2F2"/>
+          </w:tcPr>
+          <w:tcPr/>
+          <w:p>
+            <w:pPr>
+              <w:pStyle w:val="Compact"/>
+            </w:pPr>
+            <w:r>
+              <w:t xml:space="preserve">Blue Ridge Automation</w:t>
+            </w:r>
+          </w:p>
+        </w:tc>
+        <w:tc>
+          <w:tcPr>
+            <w:shd w:val="clear" w:color="auto" w:fill="F2F2F2"/>
+          </w:tcPr>
+          <w:tcPr/>
+          <w:p>
+            <w:pPr>
+              <w:pStyle w:val="Compact"/>
+            </w:pPr>
             <w:r>
               <w:rPr>
                 <w:b/>
                 <w:bCs/>
               </w:rPr>
-              <w:t xml:space="preserve"> </w:t>
-            </w:r>
-            <w:r>
-              <w:rPr>
-                <w:rStyle w:val="VerbatimChar"/>
+              <w:t xml:space="preserve">OI-16 PLC confirm BIT +</w:t>
+            </w:r>
+            <w:r>
+              <w:rPr>
                 <w:b/>
                 <w:bCs/>
               </w:rPr>
-              <w:t xml:space="preserve">RequiresCompletionConfirm</w:t>
-            </w:r>
-            <w:r>
-              <w:rPr>
+              <w:t xml:space="preserve"> </w:t>
+            </w:r>
+            <w:r>
+              <w:rPr>
+                <w:rStyle w:val="VerbatimChar"/>
                 <w:b/>
                 <w:bCs/>
               </w:rPr>
-              <w:t xml:space="preserve"> </w:t>
+              <w:t xml:space="preserve">RequiresCompletionConfirm</w:t>
             </w:r>
             <w:r>
               <w:rPr>
                 <w:b/>
                 <w:bCs/>
               </w:rPr>
+              <w:t xml:space="preserve"> </w:t>
+            </w:r>
+            <w:r>
+              <w:rPr>
+                <w:b/>
+                <w:bCs/>
+              </w:rPr>
               <w:t xml:space="preserve">LocationAttribute propagated.</w:t>
             </w:r>
             <w:r>
@@ -1291,9 +1470,6 @@
       </w:tr>
       <w:tr>
         <w:tc>
-          <w:tcPr>
-            <w:shd w:val="clear" w:color="auto" w:fill="F2F2F2"/>
-          </w:tcPr>
           <w:tcPr/>
           <w:p>
             <w:pPr>
@@ -1305,9 +1481,6 @@
           </w:p>
         </w:tc>
         <w:tc>
-          <w:tcPr>
-            <w:shd w:val="clear" w:color="auto" w:fill="F2F2F2"/>
-          </w:tcPr>
           <w:tcPr/>
           <w:p>
             <w:pPr>
@@ -1319,9 +1492,6 @@
           </w:p>
         </w:tc>
         <w:tc>
-          <w:tcPr>
-            <w:shd w:val="clear" w:color="auto" w:fill="F2F2F2"/>
-          </w:tcPr>
           <w:tcPr/>
           <w:p>
             <w:pPr>
@@ -1333,9 +1503,6 @@
           </w:p>
         </w:tc>
         <w:tc>
-          <w:tcPr>
-            <w:shd w:val="clear" w:color="auto" w:fill="F2F2F2"/>
-          </w:tcPr>
           <w:tcPr/>
           <w:p>
             <w:pPr>
@@ -1419,6 +1586,9 @@
       </w:tr>
       <w:tr>
         <w:tc>
+          <w:tcPr>
+            <w:shd w:val="clear" w:color="auto" w:fill="F2F2F2"/>
+          </w:tcPr>
           <w:tcPr/>
           <w:p>
             <w:pPr>
@@ -1430,6 +1600,9 @@
           </w:p>
         </w:tc>
         <w:tc>
+          <w:tcPr>
+            <w:shd w:val="clear" w:color="auto" w:fill="F2F2F2"/>
+          </w:tcPr>
           <w:tcPr/>
           <w:p>
             <w:pPr>
@@ -1441,6 +1614,9 @@
           </w:p>
         </w:tc>
         <w:tc>
+          <w:tcPr>
+            <w:shd w:val="clear" w:color="auto" w:fill="F2F2F2"/>
+          </w:tcPr>
           <w:tcPr/>
           <w:p>
             <w:pPr>
@@ -1452,6 +1628,9 @@
           </w:p>
         </w:tc>
         <w:tc>
+          <w:tcPr>
+            <w:shd w:val="clear" w:color="auto" w:fill="F2F2F2"/>
+          </w:tcPr>
           <w:tcPr/>
           <w:p>
             <w:pPr>
@@ -1514,9 +1693,6 @@
       </w:tr>
       <w:tr>
         <w:tc>
-          <w:tcPr>
-            <w:shd w:val="clear" w:color="auto" w:fill="F2F2F2"/>
-          </w:tcPr>
           <w:tcPr/>
           <w:p>
             <w:pPr>
@@ -1528,9 +1704,6 @@
           </w:p>
         </w:tc>
         <w:tc>
-          <w:tcPr>
-            <w:shd w:val="clear" w:color="auto" w:fill="F2F2F2"/>
-          </w:tcPr>
           <w:tcPr/>
           <w:p>
             <w:pPr>
@@ -1542,9 +1715,6 @@
           </w:p>
         </w:tc>
         <w:tc>
-          <w:tcPr>
-            <w:shd w:val="clear" w:color="auto" w:fill="F2F2F2"/>
-          </w:tcPr>
           <w:tcPr/>
           <w:p>
             <w:pPr>
@@ -1556,9 +1726,6 @@
           </w:p>
         </w:tc>
         <w:tc>
-          <w:tcPr>
-            <w:shd w:val="clear" w:color="auto" w:fill="F2F2F2"/>
-          </w:tcPr>
           <w:tcPr/>
           <w:p>
             <w:pPr>
@@ -1654,6 +1821,9 @@
       </w:tr>
       <w:tr>
         <w:tc>
+          <w:tcPr>
+            <w:shd w:val="clear" w:color="auto" w:fill="F2F2F2"/>
+          </w:tcPr>
           <w:tcPr/>
           <w:p>
             <w:pPr>
@@ -1665,6 +1835,9 @@
           </w:p>
         </w:tc>
         <w:tc>
+          <w:tcPr>
+            <w:shd w:val="clear" w:color="auto" w:fill="F2F2F2"/>
+          </w:tcPr>
           <w:tcPr/>
           <w:p>
             <w:pPr>
@@ -1676,6 +1849,9 @@
           </w:p>
         </w:tc>
         <w:tc>
+          <w:tcPr>
+            <w:shd w:val="clear" w:color="auto" w:fill="F2F2F2"/>
+          </w:tcPr>
           <w:tcPr/>
           <w:p>
             <w:pPr>
@@ -1687,6 +1863,9 @@
           </w:p>
         </w:tc>
         <w:tc>
+          <w:tcPr>
+            <w:shd w:val="clear" w:color="auto" w:fill="F2F2F2"/>
+          </w:tcPr>
           <w:tcPr/>
           <w:p>
             <w:pPr>
@@ -44872,14 +45051,28 @@
           <w:b/>
           <w:bCs/>
         </w:rPr>
-        <w:t xml:space="preserve">sql/migrations/versioned/0014_phase5_machining.sql</w:t>
-      </w:r>
-      <w:r>
-        <w:rPr>
-          <w:b/>
-          <w:bCs/>
-        </w:rPr>
-        <w:t xml:space="preserve">:</w:t>
+        <w:t xml:space="preserve">sql/migrations/versioned/&lt;next_unclaimed&gt;_arc2_phase5_machining.sql</w:t>
+      </w:r>
+      <w:r>
+        <w:t xml:space="preserve"> </w:t>
+      </w:r>
+      <w:r>
+        <w:t xml:space="preserve">(number TBD — likely</w:t>
+      </w:r>
+      <w:r>
+        <w:t xml:space="preserve"> </w:t>
+      </w:r>
+      <w:r>
+        <w:rPr>
+          <w:rStyle w:val="VerbatimChar"/>
+        </w:rPr>
+        <w:t xml:space="preserve">0020</w:t>
+      </w:r>
+      <w:r>
+        <w:t xml:space="preserve"> </w:t>
+      </w:r>
+      <w:r>
+        <w:t xml:space="preserve">after VP-4 Phase 4 migration).</w:t>
       </w:r>
     </w:p>
     <w:p>
@@ -44936,7 +45129,25 @@
         <w:t xml:space="preserve"> </w:t>
       </w:r>
       <w:r>
-        <w:t xml:space="preserve">with appropriate DataCollectionFields (</w:t>
+        <w:t xml:space="preserve">with non-hot</w:t>
+      </w:r>
+      <w:r>
+        <w:t xml:space="preserve"> </w:t>
+      </w:r>
+      <w:r>
+        <w:rPr>
+          <w:rStyle w:val="VerbatimChar"/>
+        </w:rPr>
+        <w:t xml:space="preserve">OperationTemplateField</w:t>
+      </w:r>
+      <w:r>
+        <w:t xml:space="preserve"> </w:t>
+      </w:r>
+      <w:r>
+        <w:t xml:space="preserve">entries only (per v1.9 ProductionEvent checkpoint shape —</w:t>
+      </w:r>
+      <w:r>
+        <w:t xml:space="preserve"> </w:t>
       </w:r>
       <w:r>
         <w:rPr>
@@ -44969,7 +45180,73 @@
         <w:t xml:space="preserve">CycleTimeSeconds</w:t>
       </w:r>
       <w:r>
-        <w:t xml:space="preserve">, etc. — final set confirmed with MPP).</w:t>
+        <w:t xml:space="preserve">, etc. — final set confirmed with MPP). No</w:t>
+      </w:r>
+      <w:r>
+        <w:t xml:space="preserve"> </w:t>
+      </w:r>
+      <w:r>
+        <w:rPr>
+          <w:rStyle w:val="VerbatimChar"/>
+        </w:rPr>
+        <w:t xml:space="preserve">GoodCount</w:t>
+      </w:r>
+      <w:r>
+        <w:t xml:space="preserve"> </w:t>
+      </w:r>
+      <w:r>
+        <w:t xml:space="preserve">/</w:t>
+      </w:r>
+      <w:r>
+        <w:t xml:space="preserve"> </w:t>
+      </w:r>
+      <w:r>
+        <w:rPr>
+          <w:rStyle w:val="VerbatimChar"/>
+        </w:rPr>
+        <w:t xml:space="preserve">NoGoodCount</w:t>
+      </w:r>
+      <w:r>
+        <w:t xml:space="preserve"> </w:t>
+      </w:r>
+      <w:r>
+        <w:t xml:space="preserve">DataCollectionFields (those are derived via</w:t>
+      </w:r>
+      <w:r>
+        <w:t xml:space="preserve"> </w:t>
+      </w:r>
+      <w:r>
+        <w:rPr>
+          <w:rStyle w:val="VerbatimChar"/>
+        </w:rPr>
+        <w:t xml:space="preserve">LAG()</w:t>
+      </w:r>
+      <w:r>
+        <w:t xml:space="preserve"> </w:t>
+      </w:r>
+      <w:r>
+        <w:t xml:space="preserve">over cumulative</w:t>
+      </w:r>
+      <w:r>
+        <w:t xml:space="preserve"> </w:t>
+      </w:r>
+      <w:r>
+        <w:rPr>
+          <w:rStyle w:val="VerbatimChar"/>
+        </w:rPr>
+        <w:t xml:space="preserve">ShotCount</w:t>
+      </w:r>
+      <w:r>
+        <w:t xml:space="preserve">/</w:t>
+      </w:r>
+      <w:r>
+        <w:rPr>
+          <w:rStyle w:val="VerbatimChar"/>
+        </w:rPr>
+        <w:t xml:space="preserve">ScrapCount</w:t>
+      </w:r>
+      <w:r>
+        <w:t xml:space="preserve">).</w:t>
       </w:r>
     </w:p>
     <w:p>
@@ -45017,25 +45294,101 @@
         <w:rPr>
           <w:rStyle w:val="VerbatimChar"/>
         </w:rPr>
+        <w:t xml:space="preserve">MachiningOutCompleted</w:t>
+      </w:r>
+      <w:r>
+        <w:t xml:space="preserve">. (</w:t>
+      </w:r>
+      <w:r>
+        <w:rPr>
+          <w:rStyle w:val="VerbatimChar"/>
+        </w:rPr>
         <w:t xml:space="preserve">LotSplit</w:t>
       </w:r>
       <w:r>
         <w:t xml:space="preserve"> </w:t>
       </w:r>
       <w:r>
-        <w:t xml:space="preserve">(already from Phase 2 likely),</w:t>
-      </w:r>
-      <w:r>
-        <w:t xml:space="preserve"> </w:t>
-      </w:r>
-      <w:r>
-        <w:rPr>
-          <w:rStyle w:val="VerbatimChar"/>
-        </w:rPr>
-        <w:t xml:space="preserve">MachiningOutCompleted</w:t>
-      </w:r>
-      <w:r>
-        <w:t xml:space="preserve">.</w:t>
+        <w:t xml:space="preserve">already from Phase 2.)</w:t>
+      </w:r>
+    </w:p>
+    <w:p>
+      <w:pPr>
+        <w:pStyle w:val="Compact"/>
+        <w:numPr>
+          <w:ilvl w:val="0"/>
+          <w:numId w:val="1089"/>
+        </w:numPr>
+      </w:pPr>
+      <w:r>
+        <w:rPr>
+          <w:b/>
+          <w:bCs/>
+        </w:rPr>
+        <w:t xml:space="preserve">No ALTER on</w:t>
+      </w:r>
+      <w:r>
+        <w:rPr>
+          <w:b/>
+          <w:bCs/>
+        </w:rPr>
+        <w:t xml:space="preserve"> </w:t>
+      </w:r>
+      <w:r>
+        <w:rPr>
+          <w:rStyle w:val="VerbatimChar"/>
+          <w:b/>
+          <w:bCs/>
+        </w:rPr>
+        <w:t xml:space="preserve">Parts.OperationTemplate</w:t>
+      </w:r>
+      <w:r>
+        <w:t xml:space="preserve"> </w:t>
+      </w:r>
+      <w:r>
+        <w:t xml:space="preserve">— the</w:t>
+      </w:r>
+      <w:r>
+        <w:t xml:space="preserve"> </w:t>
+      </w:r>
+      <w:r>
+        <w:rPr>
+          <w:rStyle w:val="VerbatimChar"/>
+        </w:rPr>
+        <w:t xml:space="preserve">IsPieceCountIncrement</w:t>
+      </w:r>
+      <w:r>
+        <w:t xml:space="preserve"> </w:t>
+      </w:r>
+      <w:r>
+        <w:t xml:space="preserve">flag concept from v0.1 is retired. Lot piece count is now derived from</w:t>
+      </w:r>
+      <w:r>
+        <w:t xml:space="preserve"> </w:t>
+      </w:r>
+      <w:r>
+        <w:rPr>
+          <w:rStyle w:val="VerbatimChar"/>
+        </w:rPr>
+        <w:t xml:space="preserve">Lots.v_LotDerivedQuantities</w:t>
+      </w:r>
+      <w:r>
+        <w:t xml:space="preserve"> </w:t>
+      </w:r>
+      <w:r>
+        <w:t xml:space="preserve">view (OI-23 / Phase 2) at read time; no per-event Lot.PieceCount mutation. Machining</w:t>
+      </w:r>
+      <w:r>
+        <w:t xml:space="preserve"> </w:t>
+      </w:r>
+      <w:r>
+        <w:t xml:space="preserve">“pass-through”</w:t>
+      </w:r>
+      <w:r>
+        <w:t xml:space="preserve"> </w:t>
+      </w:r>
+      <w:r>
+        <w:t xml:space="preserve">semantics fall out naturally — the view aggregates ProductionEvent counters across all events, regardless of whether they are Die Cast (production-creating) or Machining (pass-through).</w:t>
       </w:r>
     </w:p>
     <w:p>
@@ -45169,7 +45522,7 @@
                 <w:b/>
                 <w:color w:val="FFFFFF"/>
               </w:rPr>
-              <w:t xml:space="preserve">Fallback</w:t>
+              <w:t xml:space="preserve">Status</w:t>
             </w:r>
           </w:p>
         </w:tc>
@@ -45182,30 +45535,207 @@
               <w:pStyle w:val="Compact"/>
             </w:pPr>
             <w:r>
-              <w:t xml:space="preserve">UJ-03 sub-LOT split auto vs manual</w:t>
-            </w:r>
-          </w:p>
-        </w:tc>
-        <w:tc>
-          <w:tcPr/>
-          <w:p>
-            <w:pPr>
-              <w:pStyle w:val="Compact"/>
-            </w:pPr>
-            <w:r>
-              <w:t xml:space="preserve">Phase 0 resolved to auto-split with operator override. Fallback if unresolved: auto-split at</w:t>
-            </w:r>
-            <w:r>
-              <w:t xml:space="preserve"> </w:t>
-            </w:r>
-            <w:r>
-              <w:rPr>
-                <w:rStyle w:val="VerbatimChar"/>
-              </w:rPr>
-              <w:t xml:space="preserve">DefaultSubLotQty</w:t>
-            </w:r>
-            <w:r>
-              <w:t xml:space="preserve">, operator confirms or edits.</w:t>
+              <w:rPr>
+                <w:b/>
+                <w:bCs/>
+              </w:rPr>
+              <w:t xml:space="preserve">UJ-03</w:t>
+            </w:r>
+            <w:r>
+              <w:t xml:space="preserve"> </w:t>
+            </w:r>
+            <w:r>
+              <w:t xml:space="preserve">Sub-LOT split trigger (Machining IN)</w:t>
+            </w:r>
+          </w:p>
+        </w:tc>
+        <w:tc>
+          <w:tcPr/>
+          <w:p>
+            <w:pPr>
+              <w:pStyle w:val="Compact"/>
+            </w:pPr>
+            <w:r>
+              <w:rPr>
+                <w:b/>
+                <w:bCs/>
+              </w:rPr>
+              <w:t xml:space="preserve">Still In Review</w:t>
+            </w:r>
+            <w:r>
+              <w:t xml:space="preserve"> </w:t>
+            </w:r>
+            <w:r>
+              <w:t xml:space="preserve">— Ben pending. Default direction: auto-prompt 50/50 split (Option A). Ship with auto-prompt; if Ben’s input shows certain parts never split, evolve to Option C (per-Item flag) post-MVP.</w:t>
+            </w:r>
+          </w:p>
+        </w:tc>
+      </w:tr>
+      <w:tr>
+        <w:tc>
+          <w:tcPr>
+            <w:shd w:val="clear" w:color="auto" w:fill="F2F2F2"/>
+          </w:tcPr>
+          <w:tcPr/>
+          <w:p>
+            <w:pPr>
+              <w:pStyle w:val="Compact"/>
+            </w:pPr>
+            <w:r>
+              <w:rPr>
+                <w:b/>
+                <w:bCs/>
+              </w:rPr>
+              <w:t xml:space="preserve">OI-09</w:t>
+            </w:r>
+            <w:r>
+              <w:t xml:space="preserve"> </w:t>
+            </w:r>
+            <w:r>
+              <w:t xml:space="preserve">Cavity-parallel-vs-sublots</w:t>
+            </w:r>
+          </w:p>
+        </w:tc>
+        <w:tc>
+          <w:tcPr>
+            <w:shd w:val="clear" w:color="auto" w:fill="F2F2F2"/>
+          </w:tcPr>
+          <w:tcPr/>
+          <w:p>
+            <w:pPr>
+              <w:pStyle w:val="Compact"/>
+            </w:pPr>
+            <w:r>
+              <w:rPr>
+                <w:b/>
+                <w:bCs/>
+              </w:rPr>
+              <w:t xml:space="preserve">Closed (2026-04-23).</w:t>
+            </w:r>
+            <w:r>
+              <w:t xml:space="preserve"> </w:t>
+            </w:r>
+            <w:r>
+              <w:t xml:space="preserve">Confirms the Machining sublot pattern is</w:t>
+            </w:r>
+            <w:r>
+              <w:t xml:space="preserve"> </w:t>
+            </w:r>
+            <w:r>
+              <w:rPr>
+                <w:b/>
+                <w:bCs/>
+              </w:rPr>
+              <w:t xml:space="preserve">separate</w:t>
+            </w:r>
+            <w:r>
+              <w:t xml:space="preserve"> </w:t>
+            </w:r>
+            <w:r>
+              <w:t xml:space="preserve">from the Die Cast cavity-parallel-LOT pattern. Phase 5 is Machining-only sublot territory.</w:t>
+            </w:r>
+          </w:p>
+        </w:tc>
+      </w:tr>
+      <w:tr>
+        <w:tc>
+          <w:tcPr/>
+          <w:p>
+            <w:pPr>
+              <w:pStyle w:val="Compact"/>
+            </w:pPr>
+            <w:r>
+              <w:rPr>
+                <w:b/>
+                <w:bCs/>
+              </w:rPr>
+              <w:t xml:space="preserve">OI-18</w:t>
+            </w:r>
+            <w:r>
+              <w:t xml:space="preserve"> </w:t>
+            </w:r>
+            <w:r>
+              <w:t xml:space="preserve">ItemLocation cascade</w:t>
+            </w:r>
+          </w:p>
+        </w:tc>
+        <w:tc>
+          <w:tcPr/>
+          <w:p>
+            <w:pPr>
+              <w:pStyle w:val="Compact"/>
+            </w:pPr>
+            <w:r>
+              <w:rPr>
+                <w:b/>
+                <w:bCs/>
+              </w:rPr>
+              <w:t xml:space="preserve">Closed (2026-04-24).</w:t>
+            </w:r>
+            <w:r>
+              <w:t xml:space="preserve"> </w:t>
+            </w:r>
+            <w:r>
+              <w:t xml:space="preserve">Movement Scan Screen at Machining IN walks Cell → WorkCenter → Area via</w:t>
+            </w:r>
+            <w:r>
+              <w:t xml:space="preserve"> </w:t>
+            </w:r>
+            <w:r>
+              <w:rPr>
+                <w:rStyle w:val="VerbatimChar"/>
+              </w:rPr>
+              <w:t xml:space="preserve">Parts.ItemLocation_IsEligible</w:t>
+            </w:r>
+            <w:r>
+              <w:t xml:space="preserve"> </w:t>
+            </w:r>
+            <w:r>
+              <w:t xml:space="preserve">(Phase 4 reusable pattern).</w:t>
+            </w:r>
+          </w:p>
+        </w:tc>
+      </w:tr>
+      <w:tr>
+        <w:tc>
+          <w:tcPr>
+            <w:shd w:val="clear" w:color="auto" w:fill="F2F2F2"/>
+          </w:tcPr>
+          <w:tcPr/>
+          <w:p>
+            <w:pPr>
+              <w:pStyle w:val="Compact"/>
+            </w:pPr>
+            <w:r>
+              <w:rPr>
+                <w:b/>
+                <w:bCs/>
+              </w:rPr>
+              <w:t xml:space="preserve">UJ-11</w:t>
+            </w:r>
+            <w:r>
+              <w:t xml:space="preserve"> </w:t>
+            </w:r>
+            <w:r>
+              <w:t xml:space="preserve">Paper-to-screen</w:t>
+            </w:r>
+          </w:p>
+        </w:tc>
+        <w:tc>
+          <w:tcPr>
+            <w:shd w:val="clear" w:color="auto" w:fill="F2F2F2"/>
+          </w:tcPr>
+          <w:tcPr/>
+          <w:p>
+            <w:pPr>
+              <w:pStyle w:val="Compact"/>
+            </w:pPr>
+            <w:r>
+              <w:rPr>
+                <w:b/>
+                <w:bCs/>
+              </w:rPr>
+              <w:t xml:space="preserve">Closed (2026-04-27, Option A — flagged risk).</w:t>
             </w:r>
           </w:p>
         </w:tc>
@@ -45888,7 +46418,7 @@
         <w:t xml:space="preserve"> </w:t>
       </w:r>
       <w:r>
-        <w:t xml:space="preserve">executes:</w:t>
+        <w:t xml:space="preserve">executes — revised v0.2k for v1.9 checkpoint shape:</w:t>
       </w:r>
     </w:p>
     <w:p>
@@ -45915,118 +46445,119 @@
         <w:t xml:space="preserve"> </w:t>
       </w:r>
       <w:r>
-        <w:t xml:space="preserve">(internal) with the MachiningOut operation. This writes the event + values, increments the parent’s piece count by</w:t>
-      </w:r>
-      <w:r>
-        <w:t xml:space="preserve"> </w:t>
-      </w:r>
-      <w:r>
-        <w:rPr>
-          <w:rStyle w:val="VerbatimChar"/>
+        <w:t xml:space="preserve">(internal) with the MachiningOut operation, passing cumulative</w:t>
+      </w:r>
+      <w:r>
+        <w:t xml:space="preserve"> </w:t>
+      </w:r>
+      <w:r>
+        <w:rPr>
+          <w:rStyle w:val="VerbatimChar"/>
+        </w:rPr>
+        <w:t xml:space="preserve">@ShotCount</w:t>
+      </w:r>
+      <w:r>
+        <w:t xml:space="preserve"> </w:t>
+      </w:r>
+      <w:r>
+        <w:t xml:space="preserve">(operations completed at this checkpoint) and</w:t>
+      </w:r>
+      <w:r>
+        <w:t xml:space="preserve"> </w:t>
+      </w:r>
+      <w:r>
+        <w:rPr>
+          <w:rStyle w:val="VerbatimChar"/>
+        </w:rPr>
+        <w:t xml:space="preserve">@ScrapCount</w:t>
+      </w:r>
+      <w:r>
+        <w:t xml:space="preserve"> </w:t>
+      </w:r>
+      <w:r>
+        <w:t xml:space="preserve">(cumulative scraps).</w:t>
+      </w:r>
+      <w:r>
+        <w:t xml:space="preserve"> </w:t>
+      </w:r>
+      <w:r>
+        <w:rPr>
+          <w:b/>
+          <w:bCs/>
+        </w:rPr>
+        <w:t xml:space="preserve">No per-event</w:t>
+      </w:r>
+      <w:r>
+        <w:rPr>
+          <w:b/>
+          <w:bCs/>
+        </w:rPr>
+        <w:t xml:space="preserve"> </w:t>
+      </w:r>
+      <w:r>
+        <w:rPr>
+          <w:rStyle w:val="VerbatimChar"/>
+          <w:b/>
+          <w:bCs/>
         </w:rPr>
         <w:t xml:space="preserve">@GoodCount</w:t>
       </w:r>
       <w:r>
-        <w:t xml:space="preserve"> </w:t>
-      </w:r>
-      <w:r>
-        <w:t xml:space="preserve">— wait, clarification: at Machining,</w:t>
-      </w:r>
-      <w:r>
-        <w:t xml:space="preserve"> </w:t>
-      </w:r>
-      <w:r>
-        <w:rPr>
-          <w:rStyle w:val="VerbatimChar"/>
-        </w:rPr>
-        <w:t xml:space="preserve">GoodCount</w:t>
-      </w:r>
-      <w:r>
-        <w:t xml:space="preserve"> </w:t>
-      </w:r>
-      <w:r>
-        <w:t xml:space="preserve">is a through-count, the piece is already in the LOT and being processed. Treat the Machining out event as a pass-through, not an increment: set</w:t>
-      </w:r>
-      <w:r>
-        <w:t xml:space="preserve"> </w:t>
-      </w:r>
-      <w:r>
-        <w:rPr>
-          <w:rStyle w:val="VerbatimChar"/>
-        </w:rPr>
-        <w:t xml:space="preserve">@PieceCount</w:t>
-      </w:r>
-      <w:r>
-        <w:t xml:space="preserve"> </w:t>
-      </w:r>
-      <w:r>
-        <w:t xml:space="preserve">behavior on</w:t>
-      </w:r>
-      <w:r>
-        <w:t xml:space="preserve"> </w:t>
-      </w:r>
-      <w:r>
-        <w:rPr>
-          <w:rStyle w:val="VerbatimChar"/>
-        </w:rPr>
-        <w:t xml:space="preserve">ProductionEvent_Record</w:t>
-      </w:r>
-      <w:r>
-        <w:t xml:space="preserve"> </w:t>
-      </w:r>
-      <w:r>
-        <w:t xml:space="preserve">based on the OperationTemplate type. Option: a flag on</w:t>
-      </w:r>
-      <w:r>
-        <w:t xml:space="preserve"> </w:t>
-      </w:r>
-      <w:r>
-        <w:rPr>
-          <w:rStyle w:val="VerbatimChar"/>
-        </w:rPr>
-        <w:t xml:space="preserve">OperationTemplate</w:t>
-      </w:r>
-      <w:r>
-        <w:t xml:space="preserve"> </w:t>
-      </w:r>
-      <w:r>
-        <w:t xml:space="preserve">(</w:t>
-      </w:r>
-      <w:r>
-        <w:rPr>
-          <w:rStyle w:val="VerbatimChar"/>
-        </w:rPr>
-        <w:t xml:space="preserve">IsPieceCountIncrement</w:t>
-      </w:r>
-      <w:r>
-        <w:t xml:space="preserve">) that says whether this template adds pieces (Die Cast = yes) or passes them through (Machining = no). Phase 3’s</w:t>
-      </w:r>
-      <w:r>
-        <w:t xml:space="preserve"> </w:t>
-      </w:r>
-      <w:r>
-        <w:rPr>
-          <w:rStyle w:val="VerbatimChar"/>
-        </w:rPr>
-        <w:t xml:space="preserve">ProductionEvent_Record</w:t>
-      </w:r>
-      <w:r>
-        <w:t xml:space="preserve"> </w:t>
-      </w:r>
-      <w:r>
-        <w:t xml:space="preserve">honors this flag; Phase 5 seeds MachiningIn / MachiningOut with</w:t>
-      </w:r>
-      <w:r>
-        <w:t xml:space="preserve"> </w:t>
-      </w:r>
-      <w:r>
-        <w:rPr>
-          <w:rStyle w:val="VerbatimChar"/>
-        </w:rPr>
-        <w:t xml:space="preserve">IsPieceCountIncrement=0</w:t>
-      </w:r>
-      <w:r>
+        <w:rPr>
+          <w:b/>
+          <w:bCs/>
+        </w:rPr>
+        <w:t xml:space="preserve"> </w:t>
+      </w:r>
+      <w:r>
+        <w:rPr>
+          <w:b/>
+          <w:bCs/>
+        </w:rPr>
+        <w:t xml:space="preserve">/</w:t>
+      </w:r>
+      <w:r>
+        <w:rPr>
+          <w:b/>
+          <w:bCs/>
+        </w:rPr>
+        <w:t xml:space="preserve"> </w:t>
+      </w:r>
+      <w:r>
+        <w:rPr>
+          <w:rStyle w:val="VerbatimChar"/>
+          <w:b/>
+          <w:bCs/>
+        </w:rPr>
+        <w:t xml:space="preserve">@NoGoodCount</w:t>
+      </w:r>
+      <w:r>
+        <w:rPr>
+          <w:b/>
+          <w:bCs/>
+        </w:rPr>
         <w:t xml:space="preserve">.</w:t>
+      </w:r>
+      <w:r>
+        <w:t xml:space="preserve"> </w:t>
+      </w:r>
+      <w:r>
+        <w:t xml:space="preserve">No Lot.PieceCount mutation — derivation via</w:t>
+      </w:r>
+      <w:r>
+        <w:t xml:space="preserve"> </w:t>
+      </w:r>
+      <w:r>
+        <w:rPr>
+          <w:rStyle w:val="VerbatimChar"/>
+        </w:rPr>
+        <w:t xml:space="preserve">v_LotDerivedQuantities</w:t>
+      </w:r>
+      <w:r>
+        <w:t xml:space="preserve"> </w:t>
+      </w:r>
+      <w:r>
+        <w:t xml:space="preserve">(Phase 2 / OI-23).</w:t>
       </w:r>
     </w:p>
     <w:p>
@@ -46047,10 +46578,13 @@
         <w:rPr>
           <w:rStyle w:val="VerbatimChar"/>
         </w:rPr>
-        <w:t xml:space="preserve">@NoGoodCount &gt; 0</w:t>
-      </w:r>
-      <w:r>
-        <w:t xml:space="preserve">, record is captured on the event; operator can enter defect codes via follow-on</w:t>
+        <w:t xml:space="preserve">ScrapCount</w:t>
+      </w:r>
+      <w:r>
+        <w:t xml:space="preserve"> </w:t>
+      </w:r>
+      <w:r>
+        <w:t xml:space="preserve">increment from the previous checkpoint is non-zero, the operator may enter defect codes via follow-on</w:t>
       </w:r>
       <w:r>
         <w:t xml:space="preserve"> </w:t>
@@ -46065,7 +46599,7 @@
         <w:t xml:space="preserve"> </w:t>
       </w:r>
       <w:r>
-        <w:t xml:space="preserve">calls (same as Die Cast).</w:t>
+        <w:t xml:space="preserve">calls (same pattern as Die Cast).</w:t>
       </w:r>
     </w:p>
     <w:p>
@@ -46122,7 +46656,19 @@
         <w:t xml:space="preserve"> </w:t>
       </w:r>
       <w:r>
-        <w:t xml:space="preserve">is the same Machining machine (they’ll move elsewhere later via scan). Parent is reduced; if residual=0, parent goes to Closed.</w:t>
+        <w:t xml:space="preserve">is the same Machining machine (they’ll move elsewhere later via scan). Parent is reduced; if residual=0, parent goes to Closed via</w:t>
+      </w:r>
+      <w:r>
+        <w:t xml:space="preserve"> </w:t>
+      </w:r>
+      <w:r>
+        <w:rPr>
+          <w:rStyle w:val="VerbatimChar"/>
+        </w:rPr>
+        <w:t xml:space="preserve">Lot_UpdateStatus</w:t>
+      </w:r>
+      <w:r>
+        <w:t xml:space="preserve">.</w:t>
       </w:r>
     </w:p>
     <w:p>
@@ -46814,303 +47360,83 @@
           <w:b/>
           <w:bCs/>
         </w:rPr>
-        <w:t xml:space="preserve">Note:</w:t>
-      </w:r>
-      <w:r>
-        <w:t xml:space="preserve"> </w:t>
-      </w:r>
-      <w:r>
-        <w:rPr>
-          <w:rStyle w:val="VerbatimChar"/>
-        </w:rPr>
-        <w:t xml:space="preserve">ProductionEvent_Record</w:t>
-      </w:r>
-      <w:r>
-        <w:t xml:space="preserve"> </w:t>
-      </w:r>
-      <w:r>
-        <w:t xml:space="preserve">receives a small upgrade in Phase 5: honors</w:t>
-      </w:r>
-      <w:r>
-        <w:t xml:space="preserve"> </w:t>
-      </w:r>
-      <w:r>
-        <w:rPr>
-          <w:rStyle w:val="VerbatimChar"/>
-        </w:rPr>
-        <w:t xml:space="preserve">Parts.OperationTemplate.IsPieceCountIncrement</w:t>
-      </w:r>
-      <w:r>
-        <w:t xml:space="preserve"> </w:t>
-      </w:r>
-      <w:r>
-        <w:t xml:space="preserve">flag. If 0, does not increment</w:t>
-      </w:r>
-      <w:r>
-        <w:t xml:space="preserve"> </w:t>
-      </w:r>
-      <w:r>
-        <w:rPr>
-          <w:rStyle w:val="VerbatimChar"/>
-        </w:rPr>
-        <w:t xml:space="preserve">Lot.PieceCount</w:t>
-      </w:r>
-      <w:r>
-        <w:t xml:space="preserve"> </w:t>
-      </w:r>
-      <w:r>
-        <w:t xml:space="preserve">on the parent. Phase 3 deliverable gets this flag added in the Phase 3 proc source; migration 0012 (Phase 3) seeds</w:t>
-      </w:r>
-      <w:r>
-        <w:t xml:space="preserve"> </w:t>
-      </w:r>
-      <w:r>
-        <w:rPr>
-          <w:rStyle w:val="VerbatimChar"/>
-        </w:rPr>
-        <w:t xml:space="preserve">DieCastShot.IsPieceCountIncrement=1</w:t>
-      </w:r>
-      <w:r>
-        <w:t xml:space="preserve">; migration 0014 (Phase 5) seeds MachiningIn / MachiningOut with</w:t>
-      </w:r>
-      <w:r>
-        <w:t xml:space="preserve"> </w:t>
-      </w:r>
-      <w:r>
-        <w:rPr>
-          <w:rStyle w:val="VerbatimChar"/>
-        </w:rPr>
-        <w:t xml:space="preserve">IsPieceCountIncrement=0</w:t>
-      </w:r>
-      <w:r>
-        <w:t xml:space="preserve">.</w:t>
-      </w:r>
-    </w:p>
-    <w:p>
-      <w:pPr>
-        <w:pStyle w:val="BodyText"/>
-      </w:pPr>
-      <w:r>
-        <w:t xml:space="preserve">That flag needs a column in</w:t>
-      </w:r>
-      <w:r>
-        <w:t xml:space="preserve"> </w:t>
-      </w:r>
-      <w:r>
-        <w:rPr>
-          <w:rStyle w:val="VerbatimChar"/>
-        </w:rPr>
-        <w:t xml:space="preserve">Parts.OperationTemplate</w:t>
-      </w:r>
-      <w:r>
-        <w:t xml:space="preserve"> </w:t>
-      </w:r>
-      <w:r>
-        <w:t xml:space="preserve">— which means a retroactive DDL addition:</w:t>
-      </w:r>
-    </w:p>
-    <w:p>
-      <w:pPr>
-        <w:pStyle w:val="BodyText"/>
-      </w:pPr>
+        <w:t xml:space="preserve">Note (revised v0.2k):</w:t>
+      </w:r>
+      <w:r>
+        <w:t xml:space="preserve"> </w:t>
+      </w:r>
+      <w:r>
+        <w:t xml:space="preserve">The</w:t>
+      </w:r>
+      <w:r>
+        <w:t xml:space="preserve"> </w:t>
+      </w:r>
+      <w:r>
+        <w:rPr>
+          <w:rStyle w:val="VerbatimChar"/>
+        </w:rPr>
+        <w:t xml:space="preserve">IsPieceCountIncrement</w:t>
+      </w:r>
+      <w:r>
+        <w:t xml:space="preserve"> </w:t>
+      </w:r>
+      <w:r>
+        <w:t xml:space="preserve">flag concept from v0.1 is</w:t>
+      </w:r>
+      <w:r>
+        <w:t xml:space="preserve"> </w:t>
+      </w:r>
       <w:r>
         <w:rPr>
           <w:b/>
           <w:bCs/>
         </w:rPr>
-        <w:t xml:space="preserve">Migration</w:t>
-      </w:r>
-      <w:r>
-        <w:rPr>
-          <w:b/>
-          <w:bCs/>
-        </w:rPr>
-        <w:t xml:space="preserve"> </w:t>
-      </w:r>
-      <w:r>
-        <w:rPr>
-          <w:rStyle w:val="VerbatimChar"/>
-          <w:b/>
-          <w:bCs/>
-        </w:rPr>
-        <w:t xml:space="preserve">0014_phase5_machining.sql</w:t>
-      </w:r>
-      <w:r>
-        <w:rPr>
-          <w:b/>
-          <w:bCs/>
-        </w:rPr>
-        <w:t xml:space="preserve"> </w:t>
-      </w:r>
-      <w:r>
-        <w:rPr>
-          <w:b/>
-          <w:bCs/>
-        </w:rPr>
-        <w:t xml:space="preserve">also adds:</w:t>
-      </w:r>
-    </w:p>
-    <w:p>
-      <w:pPr>
-        <w:pStyle w:val="SourceCode"/>
-      </w:pPr>
-      <w:r>
-        <w:rPr>
-          <w:rStyle w:val="KeywordTok"/>
-        </w:rPr>
-        <w:t xml:space="preserve">ALTER</w:t>
-      </w:r>
-      <w:r>
-        <w:rPr>
-          <w:rStyle w:val="NormalTok"/>
-        </w:rPr>
-        <w:t xml:space="preserve"> </w:t>
-      </w:r>
-      <w:r>
-        <w:rPr>
-          <w:rStyle w:val="KeywordTok"/>
-        </w:rPr>
-        <w:t xml:space="preserve">TABLE</w:t>
-      </w:r>
-      <w:r>
-        <w:rPr>
-          <w:rStyle w:val="NormalTok"/>
-        </w:rPr>
-        <w:t xml:space="preserve"> Parts.OperationTemplate</w:t>
-      </w:r>
-      <w:r>
-        <w:br/>
-      </w:r>
-      <w:r>
-        <w:rPr>
-          <w:rStyle w:val="NormalTok"/>
-        </w:rPr>
-        <w:t xml:space="preserve">    </w:t>
-      </w:r>
-      <w:r>
-        <w:rPr>
-          <w:rStyle w:val="KeywordTok"/>
-        </w:rPr>
-        <w:t xml:space="preserve">ADD</w:t>
-      </w:r>
-      <w:r>
-        <w:rPr>
-          <w:rStyle w:val="NormalTok"/>
-        </w:rPr>
-        <w:t xml:space="preserve"> IsPieceCountIncrement BIT </w:t>
-      </w:r>
-      <w:r>
-        <w:rPr>
-          <w:rStyle w:val="KeywordTok"/>
-        </w:rPr>
-        <w:t xml:space="preserve">NOT</w:t>
-      </w:r>
-      <w:r>
-        <w:rPr>
-          <w:rStyle w:val="NormalTok"/>
-        </w:rPr>
-        <w:t xml:space="preserve"> </w:t>
-      </w:r>
-      <w:r>
-        <w:rPr>
-          <w:rStyle w:val="KeywordTok"/>
-        </w:rPr>
-        <w:t xml:space="preserve">NULL</w:t>
-      </w:r>
-      <w:r>
-        <w:rPr>
-          <w:rStyle w:val="NormalTok"/>
-        </w:rPr>
-        <w:t xml:space="preserve"> </w:t>
-      </w:r>
-      <w:r>
-        <w:rPr>
-          <w:rStyle w:val="KeywordTok"/>
-        </w:rPr>
-        <w:t xml:space="preserve">DEFAULT</w:t>
-      </w:r>
-      <w:r>
-        <w:rPr>
-          <w:rStyle w:val="NormalTok"/>
-        </w:rPr>
-        <w:t xml:space="preserve"> </w:t>
-      </w:r>
-      <w:r>
-        <w:rPr>
-          <w:rStyle w:val="DecValTok"/>
-        </w:rPr>
-        <w:t xml:space="preserve">1</w:t>
-      </w:r>
-      <w:r>
-        <w:rPr>
-          <w:rStyle w:val="NormalTok"/>
-        </w:rPr>
-        <w:t xml:space="preserve">;</w:t>
-      </w:r>
-    </w:p>
-    <w:p>
-      <w:pPr>
-        <w:pStyle w:val="FirstParagraph"/>
-      </w:pPr>
-      <w:r>
-        <w:t xml:space="preserve">and backfills seed rows (</w:t>
-      </w:r>
-      <w:r>
-        <w:rPr>
-          <w:rStyle w:val="VerbatimChar"/>
-        </w:rPr>
-        <w:t xml:space="preserve">DieCastShot</w:t>
-      </w:r>
-      <w:r>
-        <w:t xml:space="preserve">=1,</w:t>
-      </w:r>
-      <w:r>
-        <w:t xml:space="preserve"> </w:t>
-      </w:r>
-      <w:r>
-        <w:rPr>
-          <w:rStyle w:val="VerbatimChar"/>
-        </w:rPr>
-        <w:t xml:space="preserve">TrimShopOperation</w:t>
-      </w:r>
-      <w:r>
-        <w:t xml:space="preserve">=1,</w:t>
-      </w:r>
-      <w:r>
-        <w:t xml:space="preserve"> </w:t>
-      </w:r>
-      <w:r>
-        <w:rPr>
-          <w:rStyle w:val="VerbatimChar"/>
-        </w:rPr>
-        <w:t xml:space="preserve">MachiningIn</w:t>
-      </w:r>
-      <w:r>
-        <w:t xml:space="preserve">=0,</w:t>
-      </w:r>
-      <w:r>
-        <w:t xml:space="preserve"> </w:t>
-      </w:r>
-      <w:r>
-        <w:rPr>
-          <w:rStyle w:val="VerbatimChar"/>
-        </w:rPr>
-        <w:t xml:space="preserve">MachiningOut</w:t>
-      </w:r>
-      <w:r>
-        <w:t xml:space="preserve">=0,</w:t>
-      </w:r>
-      <w:r>
-        <w:t xml:space="preserve"> </w:t>
-      </w:r>
-      <w:r>
-        <w:rPr>
-          <w:rStyle w:val="VerbatimChar"/>
-        </w:rPr>
-        <w:t xml:space="preserve">ReceivingInspection</w:t>
-      </w:r>
-      <w:r>
-        <w:t xml:space="preserve">=0).</w:t>
+        <w:t xml:space="preserve">retired</w:t>
+      </w:r>
+      <w:r>
+        <w:t xml:space="preserve">. Per v1.9 ProductionEvent checkpoint shape + OI-23</w:t>
+      </w:r>
+      <w:r>
+        <w:t xml:space="preserve"> </w:t>
+      </w:r>
+      <w:r>
+        <w:rPr>
+          <w:rStyle w:val="VerbatimChar"/>
+        </w:rPr>
+        <w:t xml:space="preserve">v_LotDerivedQuantities</w:t>
+      </w:r>
+      <w:r>
+        <w:t xml:space="preserve"> </w:t>
+      </w:r>
+      <w:r>
+        <w:t xml:space="preserve">view, Lot.PieceCount is no longer mutated by</w:t>
+      </w:r>
+      <w:r>
+        <w:t xml:space="preserve"> </w:t>
+      </w:r>
+      <w:r>
+        <w:rPr>
+          <w:rStyle w:val="VerbatimChar"/>
+        </w:rPr>
+        <w:t xml:space="preserve">ProductionEvent_Record</w:t>
+      </w:r>
+      <w:r>
+        <w:t xml:space="preserve">. Derived quantities (TotalInProcess, InventoryAvailable) come from the view at read time, aggregating across all event types regardless of station semantics. No ALTER on</w:t>
+      </w:r>
+      <w:r>
+        <w:t xml:space="preserve"> </w:t>
+      </w:r>
+      <w:r>
+        <w:rPr>
+          <w:rStyle w:val="VerbatimChar"/>
+        </w:rPr>
+        <w:t xml:space="preserve">Parts.OperationTemplate</w:t>
+      </w:r>
+      <w:r>
+        <w:t xml:space="preserve"> </w:t>
+      </w:r>
+      <w:r>
+        <w:t xml:space="preserve">is required.</w:t>
       </w:r>
     </w:p>
     <w:bookmarkEnd w:id="126"/>

</xml_diff>